<commit_message>
Add learner declaration, AI-use disclosure, project links and UI screenshots to report
</commit_message>
<xml_diff>
--- a/report/MMC_Assignment_Report.docx
+++ b/report/MMC_Assignment_Report.docx
@@ -56,6 +56,183 @@
         <w:rPr>
           <w:color w:val="1A365D"/>
         </w:rPr>
+        <w:t>Learner Declaration</w:t>
+      </w:r>
+    </w:p>
+    <w:tbl>
+      <w:tblPr>
+        <w:tblStyle w:val="LightGrid-Accent1"/>
+        <w:tblW w:type="auto" w:w="0"/>
+        <w:jc w:val="center"/>
+        <w:tblLook w:firstColumn="1" w:firstRow="1" w:lastColumn="0" w:lastRow="0" w:noHBand="0" w:noVBand="1" w:val="04A0"/>
+      </w:tblPr>
+      <w:tblGrid>
+        <w:gridCol w:w="4320"/>
+        <w:gridCol w:w="4320"/>
+      </w:tblGrid>
+      <w:tr>
+        <w:tc>
+          <w:tcPr>
+            <w:tcW w:type="dxa" w:w="4320"/>
+          </w:tcPr>
+          <w:p>
+            <w:r>
+              <w:rPr>
+                <w:b/>
+              </w:rPr>
+              <w:t>Field</w:t>
+            </w:r>
+          </w:p>
+        </w:tc>
+        <w:tc>
+          <w:tcPr>
+            <w:tcW w:type="dxa" w:w="4320"/>
+          </w:tcPr>
+          <w:p>
+            <w:r>
+              <w:rPr>
+                <w:b/>
+              </w:rPr>
+              <w:t>Response</w:t>
+            </w:r>
+          </w:p>
+        </w:tc>
+      </w:tr>
+      <w:tr>
+        <w:tc>
+          <w:tcPr>
+            <w:tcW w:type="dxa" w:w="4320"/>
+          </w:tcPr>
+          <w:p>
+            <w:r>
+              <w:t>Word count</w:t>
+            </w:r>
+          </w:p>
+        </w:tc>
+        <w:tc>
+          <w:tcPr>
+            <w:tcW w:type="dxa" w:w="4320"/>
+          </w:tcPr>
+          <w:p>
+            <w:r>
+              <w:t>approx. 2,900</w:t>
+            </w:r>
+          </w:p>
+        </w:tc>
+      </w:tr>
+      <w:tr>
+        <w:tc>
+          <w:tcPr>
+            <w:tcW w:type="dxa" w:w="4320"/>
+          </w:tcPr>
+          <w:p>
+            <w:r>
+              <w:t>Use of proof-reader/proof-reading service</w:t>
+            </w:r>
+          </w:p>
+        </w:tc>
+        <w:tc>
+          <w:tcPr>
+            <w:tcW w:type="dxa" w:w="4320"/>
+          </w:tcPr>
+          <w:p>
+            <w:r>
+              <w:t>NO</w:t>
+            </w:r>
+          </w:p>
+        </w:tc>
+      </w:tr>
+      <w:tr>
+        <w:tc>
+          <w:tcPr>
+            <w:tcW w:type="dxa" w:w="4320"/>
+          </w:tcPr>
+          <w:p>
+            <w:r>
+              <w:t>I confirm that I submit this work as my own work and that I have cited all sources I have used, and I understand that using sources without citing them correctly may be considered as Academic Misconduct.</w:t>
+            </w:r>
+          </w:p>
+        </w:tc>
+        <w:tc>
+          <w:tcPr>
+            <w:tcW w:type="dxa" w:w="4320"/>
+          </w:tcPr>
+          <w:p>
+            <w:r>
+              <w:t>YES</w:t>
+            </w:r>
+          </w:p>
+        </w:tc>
+      </w:tr>
+      <w:tr>
+        <w:tc>
+          <w:tcPr>
+            <w:tcW w:type="dxa" w:w="4320"/>
+          </w:tcPr>
+          <w:p>
+            <w:r>
+              <w:t>I confirm that I have followed guidance on the acceptable use of AI tools for this assignment where such guidance has been issued by my tutors.</w:t>
+            </w:r>
+          </w:p>
+        </w:tc>
+        <w:tc>
+          <w:tcPr>
+            <w:tcW w:type="dxa" w:w="4320"/>
+          </w:tcPr>
+          <w:p>
+            <w:r>
+              <w:t>YES</w:t>
+            </w:r>
+          </w:p>
+        </w:tc>
+      </w:tr>
+      <w:tr>
+        <w:tc>
+          <w:tcPr>
+            <w:tcW w:type="dxa" w:w="4320"/>
+          </w:tcPr>
+          <w:p>
+            <w:r>
+              <w:t>Where use of appropriately cited use of AI tools is permitted, I confirm that I have cited in accordance with the UCA Harvard Referencing Standard.</w:t>
+            </w:r>
+          </w:p>
+        </w:tc>
+        <w:tc>
+          <w:tcPr>
+            <w:tcW w:type="dxa" w:w="4320"/>
+          </w:tcPr>
+          <w:p>
+            <w:r>
+              <w:t>YES</w:t>
+            </w:r>
+          </w:p>
+        </w:tc>
+      </w:tr>
+    </w:tbl>
+    <w:p/>
+    <w:p>
+      <w:r>
+        <w:rPr>
+          <w:b w:val="0"/>
+          <w:i w:val="0"/>
+          <w:sz w:val="22"/>
+        </w:rPr>
+        <w:t>Signature (Student): Saurabh Guru          Date: 17/09/2026</w:t>
+      </w:r>
+    </w:p>
+    <w:p>
+      <w:r>
+        <w:br w:type="page"/>
+      </w:r>
+    </w:p>
+    <w:p>
+      <w:pPr>
+        <w:pStyle w:val="Heading1"/>
+      </w:pPr>
+      <w:r>
+        <w:rPr>
+          <w:color w:val="1A365D"/>
+        </w:rPr>
         <w:t>AI Tool Use Declaration</w:t>
       </w:r>
     </w:p>
@@ -67,6 +244,37 @@
           <w:sz w:val="22"/>
         </w:rPr>
         <w:t>In preparing this assignment I used Claude (Anthropic, 2026), an AI coding assistant, to help implement the codebase (data generation scripts, the vision/text/speech pipelines, the fusion logic and the evaluation suite) and to help draft and structure sections of this report from my design decisions and the evaluation results the code produced. All code was run by me, and all reported metrics, figures and tables were generated from those actual runs rather than invented. I reviewed, tested and take responsibility for the full submission, including the technical choices explained throughout this report. This use is cited in accordance with the UCA Harvard Referencing Standard in the reference list below.</w:t>
+      </w:r>
+    </w:p>
+    <w:p>
+      <w:pPr>
+        <w:pStyle w:val="Heading2"/>
+      </w:pPr>
+      <w:r>
+        <w:rPr>
+          <w:color w:val="1A365D"/>
+        </w:rPr>
+        <w:t>Project Resources</w:t>
+      </w:r>
+    </w:p>
+    <w:p>
+      <w:r>
+        <w:rPr>
+          <w:b w:val="0"/>
+          <w:i w:val="0"/>
+          <w:sz w:val="22"/>
+        </w:rPr>
+        <w:t>Full source code (public GitHub repository): https://github.com/Gurusaurabh23/MMC-Airport-Chatbot</w:t>
+      </w:r>
+    </w:p>
+    <w:p>
+      <w:r>
+        <w:rPr>
+          <w:b w:val="0"/>
+          <w:i w:val="0"/>
+          <w:sz w:val="22"/>
+        </w:rPr>
+        <w:t>Live prototype: not deployed to a public URL at submission time. To run it, clone the repository above and follow the README (python -m venv, pip install -r requirements.txt, then streamlit run app.py). Screenshots of the running prototype are included in Section 8.</w:t>
       </w:r>
     </w:p>
     <w:p>
@@ -123,7 +331,7 @@
           <w:i w:val="0"/>
           <w:sz w:val="22"/>
         </w:rPr>
-        <w:t>The chatbot must process three input modalities — images of airport signage, spoken passenger questions, and typed text — and, for each, identify the relevant airport location or service, retrieve the corresponding record from a structured knowledge base, and present directions, opening hours and accessibility information through a professional interface. The system must degrade gracefully: where confidence is low, it must say so rather than fabricate an answer, and it must never present time-sensitive information (such as flight delay status) as though it were verified in real time.</w:t>
+        <w:t>The chatbot must process three input modalities — images of airport signage, spoken passenger questions, and typed text — and, for each, identify the relevant airport location or service, retrieve the corresponding record from a structured knowledge base, and present directions, opening hours and accessibility information through a professional interface. The system must degrade gracefully: where confidence is low, it should say so instead of guessing, and it must never present time-sensitive information (such as flight delay status) as though it were verified in real time.</w:t>
       </w:r>
     </w:p>
     <w:p>
@@ -289,7 +497,7 @@
           <w:i w:val="0"/>
           <w:sz w:val="22"/>
         </w:rPr>
-        <w:t>A 20-record structured knowledge base (data/knowledge_base.json) underpins every response. Each record carries: id, name, category, terminal, floor_zone, description, opening_hours, directions, accessibility, related_facilities and emergency_contact. JSON was chosen over CSV or SQLite because the schema is nested (a list-valued related_facilities field) and the whole file is small enough to load into memory once at start-up (src/knowledge_base.py) with no query-planning overhead; a production deployment with thousands of records would migrate this unchanged interface to SQLite. The knowledge base is explicitly not a trained model — it is a deterministic lookup table that the vision, text and fusion components query once a category, intent or entity has been recognised, which is what keeps the system's factual answers grounded and auditable rather than generated freeform by a language model.</w:t>
+        <w:t>A 20-record structured knowledge base (data/knowledge_base.json) underpins every response. Each record carries: id, name, category, terminal, floor_zone, description, opening_hours, directions, accessibility, related_facilities and emergency_contact. JSON was chosen over CSV or SQLite because the schema is nested (a list-valued related_facilities field) and the whole file is small enough to load into memory once at start-up (src/knowledge_base.py) with no query-planning overhead; a production deployment with thousands of records would migrate this unchanged interface to SQLite. The knowledge base is explicitly not a trained model — it is a deterministic lookup table that the vision, text and fusion components query once a category, intent or entity has been recognised, which is what keeps the system's factual answers grounded and auditable, not generated freeform by a language model.</w:t>
       </w:r>
     </w:p>
     <w:p>
@@ -310,7 +518,7 @@
           <w:i w:val="0"/>
           <w:sz w:val="22"/>
         </w:rPr>
-        <w:t>Image pipeline (src/vision_pipeline.py): images are loaded with Pillow, converted to RGB, and resized/normalised by CLIPProcessor to the 224×224 input CLIP expects, then converted to tensors and batched for embedding. Augmentation (rotation, brightness, blur, crop jitter) is applied at data-generation time rather than at load time, since the dataset is small and static rather than streamed in mini-batches for iterative training.</w:t>
+        <w:t>Image pipeline (src/vision_pipeline.py): images are loaded with Pillow, converted to RGB, and resized/normalised by CLIPProcessor to the 224×224 input CLIP expects, then converted to tensors and batched for embedding. Augmentation (rotation, brightness, blur, crop jitter) is applied at data-generation time, not at load time — the dataset is small and static, not streamed in mini-batches for iterative training.</w:t>
       </w:r>
     </w:p>
     <w:p>
@@ -330,7 +538,7 @@
           <w:i w:val="0"/>
           <w:sz w:val="22"/>
         </w:rPr>
-        <w:t>Text pipeline (src/text_pipeline.py): both typed queries and Whisper transcriptions are passed through the identical clean_text() function (lowercasing and whitespace normalisation) before being tokenised by the DistilBERT tokenizer or encoded by SBERT — this shared code path is what satisfies the requirement that typed and transcribed input go through the same NLP pipeline. Stop words were deliberately not removed: DistilBERT and SBERT are context-sensitive transformer encoders that rely on function words (e.g. 'is', 'near') for meaning, so stripping them would discard information rather than reduce noise. Entity extraction (gate code, terminal number, flight number) uses regular expressions rather than a trained NER model, which is justified given how regular these formats are in the domain (e.g. 'B12', 'Terminal 2', 'LH441').</w:t>
+        <w:t>Text pipeline (src/text_pipeline.py): both typed queries and Whisper transcriptions are passed through the identical clean_text() function (lowercasing and whitespace normalisation) before being tokenised by the DistilBERT tokenizer or encoded by SBERT — this shared code path is what satisfies the requirement that typed and transcribed input go through the same NLP pipeline. Stop words were deliberately not removed: DistilBERT and SBERT are context-sensitive transformer encoders that rely on function words (e.g. 'is', 'near') for meaning, so stripping them would discard information instead of reducing noise. Entity extraction (gate code, terminal number, flight number) uses regular expressions instead of a trained NER model — these formats are regular enough (e.g. 'B12', 'Terminal 2', 'LH441') that a trained model would add complexity without a meaningful accuracy gain.</w:t>
       </w:r>
     </w:p>
     <w:p>
@@ -404,7 +612,7 @@
           <w:i w:val="0"/>
           <w:sz w:val="22"/>
         </w:rPr>
-        <w:t>A rule-based routing strategy with a weighted-confidence agreement check was implemented (src/fusion.py) — the brief's explicitly-listed minimum-requirement strategy — in preference to a learned MLP or transformer fusion layer. This was a deliberate design trade-off: with ~100 images and ~85 text queries there is not enough data to train a fusion network without overfitting, and a transparent, inspectable rule set is more appropriate for a passenger-facing tool where every answer should be explainable. The routing logic: (1) an explicit gate code in the text (e.g. 'B12') overrides everything else; (2) a flight-status intent is intercepted before knowledge-base lookup and returns a fixed disclaimer rather than a fabricated answer (see Section 10); (3) when both text and image are supplied and agree on category, their confidences are averaged and boosted by a fixed agreement bonus; when they disagree, the higher-confidence modality wins; (4) any result below a 0.35 confidence threshold is returned as 'uncertain' with a message directing the passenger to rephrase, upload a clearer photo, or ask staff, rather than guessing.</w:t>
+        <w:t>A rule-based routing strategy with a weighted-confidence agreement check was implemented (src/fusion.py) — the brief's explicitly-listed minimum-requirement strategy — in preference to a learned MLP or transformer fusion layer. This was a deliberate design trade-off: with ~100 images and ~85 text queries there is not enough data to train a fusion network without overfitting, and a transparent, inspectable rule set is more appropriate for a passenger-facing tool where every answer should be explainable. The routing logic: (1) an explicit gate code in the text (e.g. 'B12') overrides everything else; (2) a flight-status intent is intercepted before knowledge-base lookup and returns a fixed disclaimer instead of a fabricated answer (see Section 10); (3) when both text and image are supplied and agree on category, their confidences are averaged and boosted by a fixed agreement bonus; when they disagree, the higher-confidence modality wins; (4) any result below a 0.35 confidence threshold is returned as 'uncertain', with a message directing the passenger to rephrase, upload a clearer photo, or ask staff, so the system never just guesses.</w:t>
       </w:r>
     </w:p>
     <w:p>
@@ -717,7 +925,7 @@
           <w:i w:val="0"/>
           <w:sz w:val="22"/>
         </w:rPr>
-        <w:t>The validation set reaches 100% accuracy by epoch 6. This should be read cautiously rather than as evidence of a production-ready classifier: with only 17 validation examples drawn from the same small set of hand-written templates as the training data, the model may be matching template phrasing and entity patterns rather than generalising to the full variety of real passenger language. A genuine deployment would need a much larger, more linguistically diverse query set — including misspellings, code-switching and incomplete questions — before this accuracy figure could be trusted.</w:t>
+        <w:t>The validation set reaches 100% accuracy by epoch 6. This should be read cautiously rather than as evidence of a production-ready classifier: with only 17 validation examples drawn from the same small set of hand-written templates as the training data, the model may be matching template phrasing and entity patterns instead of generalising to the full variety of real passenger language. A genuine deployment would need a much larger, more linguistically diverse query set — including misspellings, code-switching and incomplete questions — before this accuracy figure could be trusted.</w:t>
       </w:r>
     </w:p>
     <w:p>
@@ -2071,6 +2279,159 @@
       </w:r>
     </w:p>
     <w:p>
+      <w:pPr>
+        <w:jc w:val="center"/>
+      </w:pPr>
+      <w:r>
+        <w:drawing>
+          <wp:inline xmlns:a="http://schemas.openxmlformats.org/drawingml/2006/main" xmlns:pic="http://schemas.openxmlformats.org/drawingml/2006/picture">
+            <wp:extent cx="5486400" cy="4543425"/>
+            <wp:docPr id="7" name="Picture 7"/>
+            <wp:cNvGraphicFramePr>
+              <a:graphicFrameLocks noChangeAspect="1"/>
+            </wp:cNvGraphicFramePr>
+            <a:graphic>
+              <a:graphicData uri="http://schemas.openxmlformats.org/drawingml/2006/picture">
+                <pic:pic>
+                  <pic:nvPicPr>
+                    <pic:cNvPr id="0" name="screenshot_ui_home.png"/>
+                    <pic:cNvPicPr/>
+                  </pic:nvPicPr>
+                  <pic:blipFill>
+                    <a:blip r:embed="rId15"/>
+                    <a:stretch>
+                      <a:fillRect/>
+                    </a:stretch>
+                  </pic:blipFill>
+                  <pic:spPr>
+                    <a:xfrm>
+                      <a:off x="0" y="0"/>
+                      <a:ext cx="5486400" cy="4543425"/>
+                    </a:xfrm>
+                    <a:prstGeom prst="rect"/>
+                  </pic:spPr>
+                </pic:pic>
+              </a:graphicData>
+            </a:graphic>
+          </wp:inline>
+        </w:drawing>
+      </w:r>
+    </w:p>
+    <w:p>
+      <w:pPr>
+        <w:jc w:val="center"/>
+      </w:pPr>
+      <w:r>
+        <w:rPr>
+          <w:i/>
+          <w:sz w:val="18"/>
+        </w:rPr>
+        <w:t>Figure 7. The Streamlit interface: image upload, voice/audio input, text box and the 'about this prototype' panel.</w:t>
+      </w:r>
+    </w:p>
+    <w:p>
+      <w:pPr>
+        <w:jc w:val="center"/>
+      </w:pPr>
+      <w:r>
+        <w:drawing>
+          <wp:inline xmlns:a="http://schemas.openxmlformats.org/drawingml/2006/main" xmlns:pic="http://schemas.openxmlformats.org/drawingml/2006/picture">
+            <wp:extent cx="5486400" cy="6455092"/>
+            <wp:docPr id="8" name="Picture 8"/>
+            <wp:cNvGraphicFramePr>
+              <a:graphicFrameLocks noChangeAspect="1"/>
+            </wp:cNvGraphicFramePr>
+            <a:graphic>
+              <a:graphicData uri="http://schemas.openxmlformats.org/drawingml/2006/picture">
+                <pic:pic>
+                  <pic:nvPicPr>
+                    <pic:cNvPr id="0" name="screenshot_ui_answered.png"/>
+                    <pic:cNvPicPr/>
+                  </pic:nvPicPr>
+                  <pic:blipFill>
+                    <a:blip r:embed="rId16"/>
+                    <a:stretch>
+                      <a:fillRect/>
+                    </a:stretch>
+                  </pic:blipFill>
+                  <pic:spPr>
+                    <a:xfrm>
+                      <a:off x="0" y="0"/>
+                      <a:ext cx="5486400" cy="6455092"/>
+                    </a:xfrm>
+                    <a:prstGeom prst="rect"/>
+                  </pic:spPr>
+                </pic:pic>
+              </a:graphicData>
+            </a:graphic>
+          </wp:inline>
+        </w:drawing>
+      </w:r>
+    </w:p>
+    <w:p>
+      <w:pPr>
+        <w:jc w:val="center"/>
+      </w:pPr>
+      <w:r>
+        <w:rPr>
+          <w:i/>
+          <w:sz w:val="18"/>
+        </w:rPr>
+        <w:t>Figure 8. A successfully answered text query ('Where is gate B12?'), showing the grounded response and confidence bar.</w:t>
+      </w:r>
+    </w:p>
+    <w:p>
+      <w:pPr>
+        <w:jc w:val="center"/>
+      </w:pPr>
+      <w:r>
+        <w:drawing>
+          <wp:inline xmlns:a="http://schemas.openxmlformats.org/drawingml/2006/main" xmlns:pic="http://schemas.openxmlformats.org/drawingml/2006/picture">
+            <wp:extent cx="5486400" cy="8816816"/>
+            <wp:docPr id="9" name="Picture 9"/>
+            <wp:cNvGraphicFramePr>
+              <a:graphicFrameLocks noChangeAspect="1"/>
+            </wp:cNvGraphicFramePr>
+            <a:graphic>
+              <a:graphicData uri="http://schemas.openxmlformats.org/drawingml/2006/picture">
+                <pic:pic>
+                  <pic:nvPicPr>
+                    <pic:cNvPr id="0" name="screenshot_ui_debug.png"/>
+                    <pic:cNvPicPr/>
+                  </pic:nvPicPr>
+                  <pic:blipFill>
+                    <a:blip r:embed="rId17"/>
+                    <a:stretch>
+                      <a:fillRect/>
+                    </a:stretch>
+                  </pic:blipFill>
+                  <pic:spPr>
+                    <a:xfrm>
+                      <a:off x="0" y="0"/>
+                      <a:ext cx="5486400" cy="8816816"/>
+                    </a:xfrm>
+                    <a:prstGeom prst="rect"/>
+                  </pic:spPr>
+                </pic:pic>
+              </a:graphicData>
+            </a:graphic>
+          </wp:inline>
+        </w:drawing>
+      </w:r>
+    </w:p>
+    <w:p>
+      <w:pPr>
+        <w:jc w:val="center"/>
+      </w:pPr>
+      <w:r>
+        <w:rPr>
+          <w:i/>
+          <w:sz w:val="18"/>
+        </w:rPr>
+        <w:t>Figure 9. The 'debug: routing details' panel, showing which modality and route (entity match / intent / semantic retrieval / vision) produced the answer.</w:t>
+      </w:r>
+    </w:p>
+    <w:p>
       <w:r>
         <w:rPr>
           <w:b w:val="0"/>
@@ -2098,7 +2459,7 @@
           <w:i w:val="0"/>
           <w:sz w:val="22"/>
         </w:rPr>
-        <w:t>Data privacy. A deployed version of this system would process three categories of sensitive personal data: voice recordings, uploaded images (which may incidentally capture a boarding pass, passport, or bystanders), and any names, flight numbers or booking references a passenger types or speaks. None of this is currently persisted by the prototype — audio is transcribed and discarded, images are embedded and discarded, and no database logs raw queries — but a production deployment must make this an explicit, documented design decision rather than an accident of the current implementation, and should apply automatic redaction/blurring to any detected boarding-pass or passport region in an uploaded photo before it is even embedded.</w:t>
+        <w:t>Data privacy. A deployed version of this system would process three categories of sensitive personal data: voice recordings, uploaded images (which may incidentally capture a boarding pass, passport, or bystanders), and any names, flight numbers or booking references a passenger types or speaks. None of this is currently persisted by the prototype — audio is transcribed and discarded, images are embedded and discarded, and no database logs raw queries — but a production deployment must make this an explicit, documented design decision, not an accident of the current implementation, and should apply automatic redaction/blurring to any detected boarding-pass or passport region in an uploaded photo before it is even embedded.</w:t>
       </w:r>
     </w:p>
     <w:p>

</xml_diff>